<commit_message>
redmine dock and migr
</commit_message>
<xml_diff>
--- a/masich/Колосов Д.Е. - Лабораторная работа №1.docx
+++ b/masich/Колосов Д.Е. - Лабораторная работа №1.docx
@@ -3356,7 +3356,6 @@
           <w:lang w:val="ru-RU"/>
         </w:rPr>
       </w:pPr>
-      <w:bookmarkStart w:id="3" w:name="_GoBack"/>
       <w:r>
         <w:rPr>
           <w:lang w:val="ru-RU"/>
@@ -3469,7 +3468,6 @@
         <w:t>Этот бит позволяет делать поле «Адрес» гибким — от 1 до бесконечности байт, экономя место в кадре для коротких адресов и позволяя использовать длинные адреса там, где это нужно.</w:t>
       </w:r>
     </w:p>
-    <w:bookmarkEnd w:id="3"/>
     <w:p>
       <w:pPr>
         <w:ind w:firstLine="0"/>
@@ -5009,6 +5007,966 @@
       <w:pPr>
         <w:ind w:firstLine="0"/>
         <w:rPr>
+          <w:lang w:val="en-US"/>
+        </w:rPr>
+      </w:pPr>
+      <w:r>
+        <w:rPr>
+          <w:lang w:val="en-US"/>
+        </w:rPr>
+        <w:t>SNRM:</w:t>
+      </w:r>
+    </w:p>
+    <w:tbl>
+      <w:tblPr>
+        <w:tblStyle w:val="a7"/>
+        <w:tblW w:w="0" w:type="auto"/>
+        <w:tblLook w:val="04A0" w:firstRow="1" w:lastRow="0" w:firstColumn="1" w:lastColumn="0" w:noHBand="0" w:noVBand="1"/>
+      </w:tblPr>
+      <w:tblGrid>
+        <w:gridCol w:w="1613"/>
+        <w:gridCol w:w="1613"/>
+        <w:gridCol w:w="1613"/>
+        <w:gridCol w:w="1613"/>
+        <w:gridCol w:w="1613"/>
+        <w:gridCol w:w="1614"/>
+      </w:tblGrid>
+      <w:tr>
+        <w:tc>
+          <w:tcPr>
+            <w:tcW w:w="1613" w:type="dxa"/>
+            <w:vAlign w:val="center"/>
+          </w:tcPr>
+          <w:p>
+            <w:pPr>
+              <w:ind w:firstLine="0"/>
+              <w:rPr>
+                <w:lang w:val="ru-RU"/>
+              </w:rPr>
+            </w:pPr>
+            <w:r>
+              <w:rPr>
+                <w:rStyle w:val="ac"/>
+                <w:color w:val="0F1115"/>
+                <w:sz w:val="23"/>
+                <w:szCs w:val="23"/>
+              </w:rPr>
+              <w:t>Биты</w:t>
+            </w:r>
+          </w:p>
+        </w:tc>
+        <w:tc>
+          <w:tcPr>
+            <w:tcW w:w="1613" w:type="dxa"/>
+            <w:vAlign w:val="center"/>
+          </w:tcPr>
+          <w:p>
+            <w:pPr>
+              <w:ind w:firstLine="0"/>
+              <w:rPr>
+                <w:lang w:val="ru-RU"/>
+              </w:rPr>
+            </w:pPr>
+            <w:r>
+              <w:rPr>
+                <w:rStyle w:val="ac"/>
+                <w:color w:val="0F1115"/>
+                <w:sz w:val="23"/>
+                <w:szCs w:val="23"/>
+              </w:rPr>
+              <w:t>0</w:t>
+            </w:r>
+          </w:p>
+        </w:tc>
+        <w:tc>
+          <w:tcPr>
+            <w:tcW w:w="1613" w:type="dxa"/>
+            <w:vAlign w:val="center"/>
+          </w:tcPr>
+          <w:p>
+            <w:pPr>
+              <w:ind w:firstLine="0"/>
+              <w:rPr>
+                <w:lang w:val="ru-RU"/>
+              </w:rPr>
+            </w:pPr>
+            <w:r>
+              <w:rPr>
+                <w:rStyle w:val="ac"/>
+                <w:color w:val="0F1115"/>
+                <w:sz w:val="23"/>
+                <w:szCs w:val="23"/>
+              </w:rPr>
+              <w:t>1</w:t>
+            </w:r>
+          </w:p>
+        </w:tc>
+        <w:tc>
+          <w:tcPr>
+            <w:tcW w:w="1613" w:type="dxa"/>
+            <w:vAlign w:val="center"/>
+          </w:tcPr>
+          <w:p>
+            <w:pPr>
+              <w:ind w:firstLine="0"/>
+              <w:rPr>
+                <w:lang w:val="ru-RU"/>
+              </w:rPr>
+            </w:pPr>
+            <w:r>
+              <w:rPr>
+                <w:rStyle w:val="ac"/>
+                <w:color w:val="0F1115"/>
+                <w:sz w:val="23"/>
+                <w:szCs w:val="23"/>
+              </w:rPr>
+              <w:t>2-7</w:t>
+            </w:r>
+          </w:p>
+        </w:tc>
+        <w:tc>
+          <w:tcPr>
+            <w:tcW w:w="1613" w:type="dxa"/>
+            <w:vAlign w:val="center"/>
+          </w:tcPr>
+          <w:p>
+            <w:pPr>
+              <w:ind w:firstLine="0"/>
+              <w:rPr>
+                <w:lang w:val="ru-RU"/>
+              </w:rPr>
+            </w:pPr>
+            <w:r>
+              <w:rPr>
+                <w:rStyle w:val="ac"/>
+                <w:color w:val="0F1115"/>
+                <w:sz w:val="23"/>
+                <w:szCs w:val="23"/>
+              </w:rPr>
+              <w:t>8</w:t>
+            </w:r>
+          </w:p>
+        </w:tc>
+        <w:tc>
+          <w:tcPr>
+            <w:tcW w:w="1614" w:type="dxa"/>
+            <w:vAlign w:val="center"/>
+          </w:tcPr>
+          <w:p>
+            <w:pPr>
+              <w:ind w:firstLine="0"/>
+              <w:rPr>
+                <w:lang w:val="ru-RU"/>
+              </w:rPr>
+            </w:pPr>
+            <w:r>
+              <w:rPr>
+                <w:rStyle w:val="ac"/>
+                <w:color w:val="0F1115"/>
+                <w:sz w:val="23"/>
+                <w:szCs w:val="23"/>
+              </w:rPr>
+              <w:t>9-15</w:t>
+            </w:r>
+          </w:p>
+        </w:tc>
+      </w:tr>
+      <w:tr>
+        <w:tc>
+          <w:tcPr>
+            <w:tcW w:w="1613" w:type="dxa"/>
+            <w:vAlign w:val="center"/>
+          </w:tcPr>
+          <w:p>
+            <w:pPr>
+              <w:ind w:firstLine="0"/>
+              <w:rPr>
+                <w:lang w:val="ru-RU"/>
+              </w:rPr>
+            </w:pPr>
+            <w:r>
+              <w:rPr>
+                <w:color w:val="0F1115"/>
+                <w:sz w:val="23"/>
+                <w:szCs w:val="23"/>
+              </w:rPr>
+              <w:t>Назначение</w:t>
+            </w:r>
+          </w:p>
+        </w:tc>
+        <w:tc>
+          <w:tcPr>
+            <w:tcW w:w="1613" w:type="dxa"/>
+            <w:vAlign w:val="center"/>
+          </w:tcPr>
+          <w:p>
+            <w:pPr>
+              <w:ind w:firstLine="0"/>
+              <w:rPr>
+                <w:lang w:val="ru-RU"/>
+              </w:rPr>
+            </w:pPr>
+            <w:r>
+              <w:rPr>
+                <w:color w:val="0F1115"/>
+                <w:sz w:val="23"/>
+                <w:szCs w:val="23"/>
+              </w:rPr>
+              <w:t>Тип</w:t>
+            </w:r>
+          </w:p>
+        </w:tc>
+        <w:tc>
+          <w:tcPr>
+            <w:tcW w:w="1613" w:type="dxa"/>
+            <w:vAlign w:val="center"/>
+          </w:tcPr>
+          <w:p>
+            <w:pPr>
+              <w:ind w:firstLine="0"/>
+              <w:rPr>
+                <w:lang w:val="ru-RU"/>
+              </w:rPr>
+            </w:pPr>
+            <w:r>
+              <w:rPr>
+                <w:color w:val="0F1115"/>
+                <w:sz w:val="23"/>
+                <w:szCs w:val="23"/>
+              </w:rPr>
+              <w:t>Тип</w:t>
+            </w:r>
+          </w:p>
+        </w:tc>
+        <w:tc>
+          <w:tcPr>
+            <w:tcW w:w="1613" w:type="dxa"/>
+            <w:vAlign w:val="center"/>
+          </w:tcPr>
+          <w:p>
+            <w:pPr>
+              <w:ind w:firstLine="0"/>
+              <w:rPr>
+                <w:rStyle w:val="ac"/>
+                <w:color w:val="0F1115"/>
+                <w:sz w:val="23"/>
+                <w:szCs w:val="23"/>
+              </w:rPr>
+            </w:pPr>
+            <w:r>
+              <w:rPr>
+                <w:rStyle w:val="ac"/>
+                <w:color w:val="0F1115"/>
+                <w:sz w:val="23"/>
+                <w:szCs w:val="23"/>
+              </w:rPr>
+              <w:t>Код команды</w:t>
+            </w:r>
+          </w:p>
+          <w:p>
+            <w:pPr>
+              <w:ind w:firstLine="0"/>
+              <w:rPr>
+                <w:sz w:val="23"/>
+                <w:szCs w:val="23"/>
+                <w:lang w:val="ru-RU"/>
+              </w:rPr>
+            </w:pPr>
+            <w:r>
+              <w:rPr>
+                <w:sz w:val="23"/>
+                <w:szCs w:val="23"/>
+                <w:lang w:val="ru-RU"/>
+              </w:rPr>
+              <w:t>(первая часть)</w:t>
+            </w:r>
+          </w:p>
+        </w:tc>
+        <w:tc>
+          <w:tcPr>
+            <w:tcW w:w="1613" w:type="dxa"/>
+            <w:vAlign w:val="center"/>
+          </w:tcPr>
+          <w:p>
+            <w:pPr>
+              <w:ind w:firstLine="0"/>
+              <w:rPr>
+                <w:lang w:val="ru-RU"/>
+              </w:rPr>
+            </w:pPr>
+            <w:r>
+              <w:rPr>
+                <w:rStyle w:val="ac"/>
+                <w:color w:val="0F1115"/>
+                <w:sz w:val="23"/>
+                <w:szCs w:val="23"/>
+              </w:rPr>
+              <w:t>P/F</w:t>
+            </w:r>
+          </w:p>
+        </w:tc>
+        <w:tc>
+          <w:tcPr>
+            <w:tcW w:w="1614" w:type="dxa"/>
+            <w:vAlign w:val="center"/>
+          </w:tcPr>
+          <w:p>
+            <w:pPr>
+              <w:ind w:firstLine="0"/>
+              <w:rPr>
+                <w:rStyle w:val="ac"/>
+                <w:color w:val="0F1115"/>
+                <w:sz w:val="23"/>
+                <w:szCs w:val="23"/>
+              </w:rPr>
+            </w:pPr>
+            <w:r>
+              <w:rPr>
+                <w:rStyle w:val="ac"/>
+                <w:color w:val="0F1115"/>
+                <w:sz w:val="23"/>
+                <w:szCs w:val="23"/>
+              </w:rPr>
+              <w:t>Код команды</w:t>
+            </w:r>
+          </w:p>
+          <w:p>
+            <w:pPr>
+              <w:ind w:firstLine="0"/>
+              <w:rPr>
+                <w:lang w:val="ru-RU"/>
+              </w:rPr>
+            </w:pPr>
+            <w:r>
+              <w:rPr>
+                <w:sz w:val="23"/>
+                <w:szCs w:val="23"/>
+                <w:lang w:val="ru-RU"/>
+              </w:rPr>
+              <w:t>(первая часть)</w:t>
+            </w:r>
+          </w:p>
+        </w:tc>
+      </w:tr>
+      <w:tr>
+        <w:tc>
+          <w:tcPr>
+            <w:tcW w:w="1613" w:type="dxa"/>
+            <w:vAlign w:val="center"/>
+          </w:tcPr>
+          <w:p>
+            <w:pPr>
+              <w:ind w:firstLine="0"/>
+              <w:rPr>
+                <w:lang w:val="ru-RU"/>
+              </w:rPr>
+            </w:pPr>
+            <w:r>
+              <w:rPr>
+                <w:color w:val="0F1115"/>
+                <w:sz w:val="23"/>
+                <w:szCs w:val="23"/>
+              </w:rPr>
+              <w:t>Значение</w:t>
+            </w:r>
+          </w:p>
+        </w:tc>
+        <w:tc>
+          <w:tcPr>
+            <w:tcW w:w="1613" w:type="dxa"/>
+            <w:vAlign w:val="center"/>
+          </w:tcPr>
+          <w:p>
+            <w:pPr>
+              <w:ind w:firstLine="0"/>
+              <w:rPr>
+                <w:lang w:val="ru-RU"/>
+              </w:rPr>
+            </w:pPr>
+            <w:r>
+              <w:rPr>
+                <w:color w:val="0F1115"/>
+                <w:sz w:val="23"/>
+                <w:szCs w:val="23"/>
+              </w:rPr>
+              <w:t>1</w:t>
+            </w:r>
+          </w:p>
+        </w:tc>
+        <w:tc>
+          <w:tcPr>
+            <w:tcW w:w="1613" w:type="dxa"/>
+            <w:vAlign w:val="center"/>
+          </w:tcPr>
+          <w:p>
+            <w:pPr>
+              <w:ind w:firstLine="0"/>
+              <w:rPr>
+                <w:lang w:val="ru-RU"/>
+              </w:rPr>
+            </w:pPr>
+            <w:r>
+              <w:rPr>
+                <w:color w:val="0F1115"/>
+                <w:sz w:val="23"/>
+                <w:szCs w:val="23"/>
+              </w:rPr>
+              <w:t>1</w:t>
+            </w:r>
+          </w:p>
+        </w:tc>
+        <w:tc>
+          <w:tcPr>
+            <w:tcW w:w="1613" w:type="dxa"/>
+            <w:vAlign w:val="center"/>
+          </w:tcPr>
+          <w:p>
+            <w:pPr>
+              <w:ind w:firstLine="0"/>
+              <w:rPr>
+                <w:lang w:val="ru-RU"/>
+              </w:rPr>
+            </w:pPr>
+            <w:r>
+              <w:rPr>
+                <w:color w:val="0F1115"/>
+                <w:sz w:val="23"/>
+                <w:szCs w:val="23"/>
+              </w:rPr>
+              <w:t>100011</w:t>
+            </w:r>
+          </w:p>
+        </w:tc>
+        <w:tc>
+          <w:tcPr>
+            <w:tcW w:w="1613" w:type="dxa"/>
+            <w:vAlign w:val="center"/>
+          </w:tcPr>
+          <w:p>
+            <w:pPr>
+              <w:ind w:firstLine="0"/>
+              <w:rPr>
+                <w:lang w:val="ru-RU"/>
+              </w:rPr>
+            </w:pPr>
+            <w:r>
+              <w:rPr>
+                <w:color w:val="0F1115"/>
+                <w:sz w:val="23"/>
+                <w:szCs w:val="23"/>
+              </w:rPr>
+              <w:t>0 или 1</w:t>
+            </w:r>
+          </w:p>
+        </w:tc>
+        <w:tc>
+          <w:tcPr>
+            <w:tcW w:w="1614" w:type="dxa"/>
+            <w:vAlign w:val="center"/>
+          </w:tcPr>
+          <w:p>
+            <w:pPr>
+              <w:ind w:firstLine="0"/>
+              <w:rPr>
+                <w:lang w:val="ru-RU"/>
+              </w:rPr>
+            </w:pPr>
+            <w:r>
+              <w:rPr>
+                <w:color w:val="0F1115"/>
+                <w:sz w:val="23"/>
+                <w:szCs w:val="23"/>
+              </w:rPr>
+              <w:t>0000011</w:t>
+            </w:r>
+          </w:p>
+        </w:tc>
+      </w:tr>
+    </w:tbl>
+    <w:p>
+      <w:pPr>
+        <w:ind w:firstLine="0"/>
+        <w:rPr>
+          <w:lang w:val="en-US"/>
+        </w:rPr>
+      </w:pPr>
+      <w:r>
+        <w:rPr>
+          <w:lang w:val="en-US"/>
+        </w:rPr>
+        <w:t>UA:</w:t>
+      </w:r>
+    </w:p>
+    <w:tbl>
+      <w:tblPr>
+        <w:tblStyle w:val="a7"/>
+        <w:tblW w:w="0" w:type="auto"/>
+        <w:tblLook w:val="04A0" w:firstRow="1" w:lastRow="0" w:firstColumn="1" w:lastColumn="0" w:noHBand="0" w:noVBand="1"/>
+      </w:tblPr>
+      <w:tblGrid>
+        <w:gridCol w:w="1613"/>
+        <w:gridCol w:w="1613"/>
+        <w:gridCol w:w="1613"/>
+        <w:gridCol w:w="1613"/>
+        <w:gridCol w:w="1613"/>
+        <w:gridCol w:w="1614"/>
+      </w:tblGrid>
+      <w:tr>
+        <w:tc>
+          <w:tcPr>
+            <w:tcW w:w="1613" w:type="dxa"/>
+            <w:vAlign w:val="center"/>
+          </w:tcPr>
+          <w:p>
+            <w:pPr>
+              <w:ind w:firstLine="0"/>
+              <w:rPr>
+                <w:lang w:val="ru-RU"/>
+              </w:rPr>
+            </w:pPr>
+            <w:r>
+              <w:rPr>
+                <w:rStyle w:val="ac"/>
+                <w:color w:val="0F1115"/>
+                <w:sz w:val="23"/>
+                <w:szCs w:val="23"/>
+              </w:rPr>
+              <w:t>Биты</w:t>
+            </w:r>
+          </w:p>
+        </w:tc>
+        <w:tc>
+          <w:tcPr>
+            <w:tcW w:w="1613" w:type="dxa"/>
+            <w:vAlign w:val="center"/>
+          </w:tcPr>
+          <w:p>
+            <w:pPr>
+              <w:ind w:firstLine="0"/>
+              <w:rPr>
+                <w:lang w:val="ru-RU"/>
+              </w:rPr>
+            </w:pPr>
+            <w:r>
+              <w:rPr>
+                <w:rStyle w:val="ac"/>
+                <w:color w:val="0F1115"/>
+                <w:sz w:val="23"/>
+                <w:szCs w:val="23"/>
+              </w:rPr>
+              <w:t>0</w:t>
+            </w:r>
+          </w:p>
+        </w:tc>
+        <w:tc>
+          <w:tcPr>
+            <w:tcW w:w="1613" w:type="dxa"/>
+            <w:vAlign w:val="center"/>
+          </w:tcPr>
+          <w:p>
+            <w:pPr>
+              <w:ind w:firstLine="0"/>
+              <w:rPr>
+                <w:lang w:val="ru-RU"/>
+              </w:rPr>
+            </w:pPr>
+            <w:r>
+              <w:rPr>
+                <w:rStyle w:val="ac"/>
+                <w:color w:val="0F1115"/>
+                <w:sz w:val="23"/>
+                <w:szCs w:val="23"/>
+              </w:rPr>
+              <w:t>1</w:t>
+            </w:r>
+          </w:p>
+        </w:tc>
+        <w:tc>
+          <w:tcPr>
+            <w:tcW w:w="1613" w:type="dxa"/>
+            <w:vAlign w:val="center"/>
+          </w:tcPr>
+          <w:p>
+            <w:pPr>
+              <w:ind w:firstLine="0"/>
+              <w:rPr>
+                <w:lang w:val="ru-RU"/>
+              </w:rPr>
+            </w:pPr>
+            <w:r>
+              <w:rPr>
+                <w:rStyle w:val="ac"/>
+                <w:color w:val="0F1115"/>
+                <w:sz w:val="23"/>
+                <w:szCs w:val="23"/>
+              </w:rPr>
+              <w:t>2-7</w:t>
+            </w:r>
+          </w:p>
+        </w:tc>
+        <w:tc>
+          <w:tcPr>
+            <w:tcW w:w="1613" w:type="dxa"/>
+            <w:vAlign w:val="center"/>
+          </w:tcPr>
+          <w:p>
+            <w:pPr>
+              <w:ind w:firstLine="0"/>
+              <w:rPr>
+                <w:lang w:val="ru-RU"/>
+              </w:rPr>
+            </w:pPr>
+            <w:r>
+              <w:rPr>
+                <w:rStyle w:val="ac"/>
+                <w:color w:val="0F1115"/>
+                <w:sz w:val="23"/>
+                <w:szCs w:val="23"/>
+              </w:rPr>
+              <w:t>8</w:t>
+            </w:r>
+          </w:p>
+        </w:tc>
+        <w:tc>
+          <w:tcPr>
+            <w:tcW w:w="1614" w:type="dxa"/>
+            <w:vAlign w:val="center"/>
+          </w:tcPr>
+          <w:p>
+            <w:pPr>
+              <w:ind w:firstLine="0"/>
+              <w:rPr>
+                <w:lang w:val="ru-RU"/>
+              </w:rPr>
+            </w:pPr>
+            <w:r>
+              <w:rPr>
+                <w:rStyle w:val="ac"/>
+                <w:color w:val="0F1115"/>
+                <w:sz w:val="23"/>
+                <w:szCs w:val="23"/>
+              </w:rPr>
+              <w:t>9-15</w:t>
+            </w:r>
+          </w:p>
+        </w:tc>
+      </w:tr>
+      <w:tr>
+        <w:tc>
+          <w:tcPr>
+            <w:tcW w:w="1613" w:type="dxa"/>
+            <w:vAlign w:val="center"/>
+          </w:tcPr>
+          <w:p>
+            <w:pPr>
+              <w:ind w:firstLine="0"/>
+              <w:rPr>
+                <w:lang w:val="ru-RU"/>
+              </w:rPr>
+            </w:pPr>
+            <w:r>
+              <w:rPr>
+                <w:color w:val="0F1115"/>
+                <w:sz w:val="23"/>
+                <w:szCs w:val="23"/>
+              </w:rPr>
+              <w:t>Назначение</w:t>
+            </w:r>
+          </w:p>
+        </w:tc>
+        <w:tc>
+          <w:tcPr>
+            <w:tcW w:w="1613" w:type="dxa"/>
+            <w:vAlign w:val="center"/>
+          </w:tcPr>
+          <w:p>
+            <w:pPr>
+              <w:ind w:firstLine="0"/>
+              <w:rPr>
+                <w:lang w:val="ru-RU"/>
+              </w:rPr>
+            </w:pPr>
+            <w:r>
+              <w:rPr>
+                <w:color w:val="0F1115"/>
+                <w:sz w:val="23"/>
+                <w:szCs w:val="23"/>
+              </w:rPr>
+              <w:t>Тип</w:t>
+            </w:r>
+          </w:p>
+        </w:tc>
+        <w:tc>
+          <w:tcPr>
+            <w:tcW w:w="1613" w:type="dxa"/>
+            <w:vAlign w:val="center"/>
+          </w:tcPr>
+          <w:p>
+            <w:pPr>
+              <w:ind w:firstLine="0"/>
+              <w:rPr>
+                <w:lang w:val="ru-RU"/>
+              </w:rPr>
+            </w:pPr>
+            <w:r>
+              <w:rPr>
+                <w:color w:val="0F1115"/>
+                <w:sz w:val="23"/>
+                <w:szCs w:val="23"/>
+              </w:rPr>
+              <w:t>Тип</w:t>
+            </w:r>
+          </w:p>
+        </w:tc>
+        <w:tc>
+          <w:tcPr>
+            <w:tcW w:w="1613" w:type="dxa"/>
+            <w:vAlign w:val="center"/>
+          </w:tcPr>
+          <w:p>
+            <w:pPr>
+              <w:ind w:firstLine="0"/>
+              <w:rPr>
+                <w:rStyle w:val="ac"/>
+                <w:color w:val="0F1115"/>
+                <w:sz w:val="23"/>
+                <w:szCs w:val="23"/>
+              </w:rPr>
+            </w:pPr>
+            <w:r>
+              <w:rPr>
+                <w:rStyle w:val="ac"/>
+                <w:color w:val="0F1115"/>
+                <w:sz w:val="23"/>
+                <w:szCs w:val="23"/>
+              </w:rPr>
+              <w:t>Код команды</w:t>
+            </w:r>
+          </w:p>
+          <w:p>
+            <w:pPr>
+              <w:ind w:firstLine="0"/>
+              <w:rPr>
+                <w:sz w:val="23"/>
+                <w:szCs w:val="23"/>
+                <w:lang w:val="ru-RU"/>
+              </w:rPr>
+            </w:pPr>
+            <w:r>
+              <w:rPr>
+                <w:sz w:val="23"/>
+                <w:szCs w:val="23"/>
+                <w:lang w:val="ru-RU"/>
+              </w:rPr>
+              <w:t>(первая часть)</w:t>
+            </w:r>
+          </w:p>
+        </w:tc>
+        <w:tc>
+          <w:tcPr>
+            <w:tcW w:w="1613" w:type="dxa"/>
+            <w:vAlign w:val="center"/>
+          </w:tcPr>
+          <w:p>
+            <w:pPr>
+              <w:ind w:firstLine="0"/>
+              <w:rPr>
+                <w:lang w:val="ru-RU"/>
+              </w:rPr>
+            </w:pPr>
+            <w:r>
+              <w:rPr>
+                <w:rStyle w:val="ac"/>
+                <w:color w:val="0F1115"/>
+                <w:sz w:val="23"/>
+                <w:szCs w:val="23"/>
+              </w:rPr>
+              <w:t>P/F</w:t>
+            </w:r>
+          </w:p>
+        </w:tc>
+        <w:tc>
+          <w:tcPr>
+            <w:tcW w:w="1614" w:type="dxa"/>
+            <w:vAlign w:val="center"/>
+          </w:tcPr>
+          <w:p>
+            <w:pPr>
+              <w:ind w:firstLine="0"/>
+              <w:rPr>
+                <w:rStyle w:val="ac"/>
+                <w:color w:val="0F1115"/>
+                <w:sz w:val="23"/>
+                <w:szCs w:val="23"/>
+              </w:rPr>
+            </w:pPr>
+            <w:r>
+              <w:rPr>
+                <w:rStyle w:val="ac"/>
+                <w:color w:val="0F1115"/>
+                <w:sz w:val="23"/>
+                <w:szCs w:val="23"/>
+              </w:rPr>
+              <w:t>Код команды</w:t>
+            </w:r>
+          </w:p>
+          <w:p>
+            <w:pPr>
+              <w:ind w:firstLine="0"/>
+              <w:rPr>
+                <w:lang w:val="ru-RU"/>
+              </w:rPr>
+            </w:pPr>
+            <w:r>
+              <w:rPr>
+                <w:sz w:val="23"/>
+                <w:szCs w:val="23"/>
+                <w:lang w:val="ru-RU"/>
+              </w:rPr>
+              <w:t>(первая часть)</w:t>
+            </w:r>
+          </w:p>
+        </w:tc>
+      </w:tr>
+      <w:tr>
+        <w:tc>
+          <w:tcPr>
+            <w:tcW w:w="1613" w:type="dxa"/>
+            <w:vAlign w:val="center"/>
+          </w:tcPr>
+          <w:p>
+            <w:pPr>
+              <w:ind w:firstLine="0"/>
+              <w:rPr>
+                <w:lang w:val="ru-RU"/>
+              </w:rPr>
+            </w:pPr>
+            <w:r>
+              <w:rPr>
+                <w:color w:val="0F1115"/>
+                <w:sz w:val="23"/>
+                <w:szCs w:val="23"/>
+              </w:rPr>
+              <w:t>Значение</w:t>
+            </w:r>
+          </w:p>
+        </w:tc>
+        <w:tc>
+          <w:tcPr>
+            <w:tcW w:w="1613" w:type="dxa"/>
+            <w:vAlign w:val="center"/>
+          </w:tcPr>
+          <w:p>
+            <w:pPr>
+              <w:ind w:firstLine="0"/>
+              <w:rPr>
+                <w:lang w:val="ru-RU"/>
+              </w:rPr>
+            </w:pPr>
+            <w:r>
+              <w:rPr>
+                <w:color w:val="0F1115"/>
+                <w:sz w:val="23"/>
+                <w:szCs w:val="23"/>
+              </w:rPr>
+              <w:t>1</w:t>
+            </w:r>
+          </w:p>
+        </w:tc>
+        <w:tc>
+          <w:tcPr>
+            <w:tcW w:w="1613" w:type="dxa"/>
+            <w:vAlign w:val="center"/>
+          </w:tcPr>
+          <w:p>
+            <w:pPr>
+              <w:ind w:firstLine="0"/>
+              <w:rPr>
+                <w:lang w:val="ru-RU"/>
+              </w:rPr>
+            </w:pPr>
+            <w:r>
+              <w:rPr>
+                <w:color w:val="0F1115"/>
+                <w:sz w:val="23"/>
+                <w:szCs w:val="23"/>
+              </w:rPr>
+              <w:t>1</w:t>
+            </w:r>
+          </w:p>
+        </w:tc>
+        <w:tc>
+          <w:tcPr>
+            <w:tcW w:w="1613" w:type="dxa"/>
+            <w:vAlign w:val="center"/>
+          </w:tcPr>
+          <w:p>
+            <w:pPr>
+              <w:ind w:firstLine="0"/>
+              <w:rPr>
+                <w:lang w:val="ru-RU"/>
+              </w:rPr>
+            </w:pPr>
+            <w:r>
+              <w:rPr>
+                <w:color w:val="0F1115"/>
+                <w:sz w:val="23"/>
+                <w:szCs w:val="23"/>
+              </w:rPr>
+              <w:t>011000</w:t>
+            </w:r>
+          </w:p>
+        </w:tc>
+        <w:tc>
+          <w:tcPr>
+            <w:tcW w:w="1613" w:type="dxa"/>
+            <w:vAlign w:val="center"/>
+          </w:tcPr>
+          <w:p>
+            <w:pPr>
+              <w:ind w:firstLine="0"/>
+              <w:rPr>
+                <w:lang w:val="ru-RU"/>
+              </w:rPr>
+            </w:pPr>
+            <w:r>
+              <w:rPr>
+                <w:color w:val="0F1115"/>
+                <w:sz w:val="23"/>
+                <w:szCs w:val="23"/>
+              </w:rPr>
+              <w:t>0 или 1</w:t>
+            </w:r>
+          </w:p>
+        </w:tc>
+        <w:tc>
+          <w:tcPr>
+            <w:tcW w:w="1614" w:type="dxa"/>
+            <w:vAlign w:val="center"/>
+          </w:tcPr>
+          <w:p>
+            <w:pPr>
+              <w:ind w:firstLine="0"/>
+              <w:rPr>
+                <w:lang w:val="ru-RU"/>
+              </w:rPr>
+            </w:pPr>
+            <w:r>
+              <w:rPr>
+                <w:color w:val="0F1115"/>
+                <w:sz w:val="23"/>
+                <w:szCs w:val="23"/>
+              </w:rPr>
+              <w:t>0000011</w:t>
+            </w:r>
+          </w:p>
+        </w:tc>
+      </w:tr>
+    </w:tbl>
+    <w:p>
+      <w:pPr>
+        <w:ind w:firstLine="0"/>
+        <w:rPr>
           <w:lang w:val="ru-RU"/>
         </w:rPr>
       </w:pPr>
@@ -5017,11 +5975,11 @@
       <w:pPr>
         <w:pStyle w:val="1"/>
       </w:pPr>
-      <w:bookmarkStart w:id="4" w:name="_Toc222328175"/>
+      <w:bookmarkStart w:id="3" w:name="_Toc222328175"/>
       <w:r>
         <w:t>Ход работы</w:t>
       </w:r>
-      <w:bookmarkEnd w:id="4"/>
+      <w:bookmarkEnd w:id="3"/>
     </w:p>
     <w:p>
       <w:pPr>
@@ -6436,25 +7394,18 @@
     </w:tbl>
     <w:p>
       <w:pPr>
+        <w:jc w:val="right"/>
         <w:rPr>
           <w:noProof/>
           <w:lang w:val="ru-RU"/>
         </w:rPr>
       </w:pPr>
-    </w:p>
-    <w:p>
-      <w:pPr>
-        <w:jc w:val="right"/>
+      <w:r>
         <w:rPr>
           <w:noProof/>
           <w:lang w:val="ru-RU"/>
         </w:rPr>
-      </w:pPr>
-      <w:r>
-        <w:rPr>
-          <w:noProof/>
-          <w:lang w:val="ru-RU"/>
-        </w:rPr>
+        <w:lastRenderedPageBreak/>
         <w:t>Продолжение таблицы 1</w:t>
       </w:r>
     </w:p>
@@ -11304,6 +12255,7 @@
           <w:noProof/>
           <w:lang w:val="en-US"/>
         </w:rPr>
+        <w:lastRenderedPageBreak/>
         <w:t>Продолжение таблицы 1</w:t>
       </w:r>
     </w:p>
@@ -12617,7 +13569,6 @@
         <w:rPr>
           <w:lang w:val="ru-RU"/>
         </w:rPr>
-        <w:lastRenderedPageBreak/>
         <w:t xml:space="preserve">t: Станция A передаёт команду </w:t>
       </w:r>
       <w:r>
@@ -12730,7 +13681,21 @@
         <w:rPr>
           <w:lang w:val="ru-RU"/>
         </w:rPr>
-        <w:t xml:space="preserve"> устанавливает бит P (окно)</w:t>
+        <w:t xml:space="preserve"> устанавливает бит P (</w:t>
+      </w:r>
+      <w:r>
+        <w:rPr>
+          <w:lang w:val="ru-RU"/>
+        </w:rPr>
+        <w:t xml:space="preserve">передается </w:t>
+      </w:r>
+      <w:bookmarkStart w:id="4" w:name="_GoBack"/>
+      <w:bookmarkEnd w:id="4"/>
+      <w:r>
+        <w:rPr>
+          <w:lang w:val="ru-RU"/>
+        </w:rPr>
+        <w:t>окно)</w:t>
       </w:r>
     </w:p>
     <w:p>
@@ -13068,6 +14033,7 @@
         <w:rPr>
           <w:lang w:val="ru-RU"/>
         </w:rPr>
+        <w:lastRenderedPageBreak/>
         <w:t>t+</w:t>
       </w:r>
       <w:r>
@@ -13306,7 +14272,6 @@
         <w:rPr>
           <w:lang w:val="ru-RU"/>
         </w:rPr>
-        <w:lastRenderedPageBreak/>
         <w:br w:type="page"/>
       </w:r>
     </w:p>
@@ -15119,7 +16084,7 @@
 </file>
 
 <file path=customXml/itemProps1.xml><?xml version="1.0" encoding="utf-8"?>
-<ds:datastoreItem xmlns:ds="http://schemas.openxmlformats.org/officeDocument/2006/customXml" ds:itemID="{187B09BD-450A-4491-B113-2D34709D423C}">
+<ds:datastoreItem xmlns:ds="http://schemas.openxmlformats.org/officeDocument/2006/customXml" ds:itemID="{E7DF46BB-07E6-4E99-8EDC-0379F3F6258F}">
   <ds:schemaRefs>
     <ds:schemaRef ds:uri="http://schemas.openxmlformats.org/officeDocument/2006/bibliography"/>
   </ds:schemaRefs>

</xml_diff>